<commit_message>
feat: add verified approval-sync case and quality-objection lessons
</commit_message>
<xml_diff>
--- a/docs/NCC专有Skill使用说明.docx
+++ b/docs/NCC专有Skill使用说明.docx
@@ -217,7 +217,7 @@
                 <w:b w:val="0"/>
                 <w:sz w:val="19"/>
               </w:rPr>
-              <w:t>1.0.0</w:t>
+              <w:t>1.1.0</w:t>
             </w:r>
           </w:p>
         </w:tc>
@@ -265,7 +265,7 @@
                 <w:b w:val="0"/>
                 <w:sz w:val="19"/>
               </w:rPr>
-              <w:t>2026-08-01</w:t>
+              <w:t>2026-08-07</w:t>
             </w:r>
           </w:p>
         </w:tc>
@@ -472,7 +472,7 @@
           <w:b w:val="0"/>
           <w:sz w:val="21"/>
         </w:rPr>
-        <w:t>1.  解压 ncc-development-v1.0.0.zip，得到唯一目录 ncc-development。</w:t>
+        <w:t>1.  解压 ncc-development-v1.1.0.zip，得到唯一目录 ncc-development。</w:t>
       </w:r>
     </w:p>
     <w:p>
@@ -2030,7 +2030,7 @@
         <w:color w:val="5C6874"/>
         <w:sz w:val="16"/>
       </w:rPr>
-      <w:t>ncc-development  |  v1.0.0  |  2026-08-01</w:t>
+      <w:t>ncc-development  |  v1.1.0  |  2026-08-07</w:t>
     </w:r>
   </w:p>
 </w:ftr>

</xml_diff>